<commit_message>
Put the final grid result into every artefact
The deck still carried only the compositing Stage 2 numbers (+14.2%, 3.3x) and
none of the inpainting results. Added a slide with the four inpainting arms, the
20-cell grid, and speaker notes.

grid_heatmap.png visualises the grid as two sequential heatmaps, net and
collateral, with the optimum boxed. Annotations sit outside the cells: placed
inside they collided with the values at 0.2/48 and 0.5/64.

Report gains the figure, so the numbers now appear as a table and as a surface.

Final verified results, everywhere:
  Stage 1     IoU 0.2065 +/- 0.0072, beats CLIPSeg 0.1849 and human masks 0.1511
  Latency     5.30 ms/instruction vs 54.3, 32x fewer trainable params
  Stage 2     +39.5% net at 22.2% collateral, below whole-frame's 24.2%
  Ceiling     insertion bounded at 0.2119, we reach 56%

Co-Authored-By: Claude Opus 5 <noreply@anthropic.com>
</commit_message>
<xml_diff>
--- a/docs/Review1_Technical_Report.docx
+++ b/docs/Review1_Technical_Report.docx
@@ -13265,6 +13265,59 @@
     </w:p>
     <w:p>
       <w:pPr>
+        <w:jc w:val="center"/>
+      </w:pPr>
+      <w:r>
+        <w:drawing>
+          <wp:inline xmlns:a="http://schemas.openxmlformats.org/drawingml/2006/main" xmlns:pic="http://schemas.openxmlformats.org/drawingml/2006/picture">
+            <wp:extent cx="5669280" cy="1934422"/>
+            <wp:docPr id="4" name="Picture 4"/>
+            <wp:cNvGraphicFramePr>
+              <a:graphicFrameLocks noChangeAspect="1"/>
+            </wp:cNvGraphicFramePr>
+            <a:graphic>
+              <a:graphicData uri="http://schemas.openxmlformats.org/drawingml/2006/picture">
+                <pic:pic>
+                  <pic:nvPicPr>
+                    <pic:cNvPr id="0" name="grid_heatmap.png"/>
+                    <pic:cNvPicPr/>
+                  </pic:nvPicPr>
+                  <pic:blipFill>
+                    <a:blip r:embed="rId12"/>
+                    <a:stretch>
+                      <a:fillRect/>
+                    </a:stretch>
+                  </pic:blipFill>
+                  <pic:spPr>
+                    <a:xfrm>
+                      <a:off x="0" y="0"/>
+                      <a:ext cx="5669280" cy="1934422"/>
+                    </a:xfrm>
+                    <a:prstGeom prst="rect"/>
+                  </pic:spPr>
+                </pic:pic>
+              </a:graphicData>
+            </a:graphic>
+          </wp:inline>
+        </w:drawing>
+      </w:r>
+    </w:p>
+    <w:p>
+      <w:pPr>
+        <w:spacing w:after="200"/>
+        <w:jc w:val="left"/>
+      </w:pPr>
+      <w:r>
+        <w:rPr>
+          <w:i/>
+          <w:color w:val="5A5852"/>
+          <w:sz w:val="19"/>
+        </w:rPr>
+        <w:t>Figure 5. The operating-point grid. Net peaks at threshold 0.3 with 32 px of dilation and falls away in all four directions; collateral is monotonic in both parameters and carries no optimum.</w:t>
+      </w:r>
+    </w:p>
+    <w:p>
+      <w:pPr>
         <w:spacing w:after="120"/>
         <w:jc w:val="both"/>
       </w:pPr>
@@ -13672,7 +13725,7 @@
         <w:drawing>
           <wp:inline xmlns:a="http://schemas.openxmlformats.org/drawingml/2006/main" xmlns:pic="http://schemas.openxmlformats.org/drawingml/2006/picture">
             <wp:extent cx="5669280" cy="3645839"/>
-            <wp:docPr id="4" name="Picture 4"/>
+            <wp:docPr id="5" name="Picture 5"/>
             <wp:cNvGraphicFramePr>
               <a:graphicFrameLocks noChangeAspect="1"/>
             </wp:cNvGraphicFramePr>
@@ -13684,7 +13737,7 @@
                     <pic:cNvPicPr/>
                   </pic:nvPicPr>
                   <pic:blipFill>
-                    <a:blip r:embed="rId12"/>
+                    <a:blip r:embed="rId13"/>
                     <a:stretch>
                       <a:fillRect/>
                     </a:stretch>

</xml_diff>